<commit_message>
Backup auto 2025-09-29 21:00:22
</commit_message>
<xml_diff>
--- a/ZZ échanges ChatGpt Gemini/00000_250929_prompt pour  Doc État du Projet.docx
+++ b/ZZ échanges ChatGpt Gemini/00000_250929_prompt pour  Doc État du Projet.docx
@@ -209,7 +209,7 @@
           <w:lang w:val="fr-FR"/>
         </w:rPr>
         <w:pict w14:anchorId="78130984">
-          <v:rect id="_x0000_i1091" style="width:0;height:1.5pt" o:hralign="center" o:hrstd="t" o:hr="t" fillcolor="#a0a0a0" stroked="f"/>
+          <v:rect id="_x0000_i1025" style="width:0;height:1.5pt" o:hralign="center" o:hrstd="t" o:hr="t" fillcolor="#a0a0a0" stroked="f"/>
         </w:pict>
       </w:r>
     </w:p>
@@ -373,7 +373,7 @@
           <w:lang w:val="fr-FR"/>
         </w:rPr>
         <w:pict w14:anchorId="0D60F82E">
-          <v:rect id="_x0000_i1092" style="width:0;height:1.5pt" o:hralign="center" o:hrstd="t" o:hr="t" fillcolor="#a0a0a0" stroked="f"/>
+          <v:rect id="_x0000_i1026" style="width:0;height:1.5pt" o:hralign="center" o:hrstd="t" o:hr="t" fillcolor="#a0a0a0" stroked="f"/>
         </w:pict>
       </w:r>
     </w:p>
@@ -636,7 +636,7 @@
           <w:lang w:val="fr-FR"/>
         </w:rPr>
         <w:pict w14:anchorId="5C1DAD7D">
-          <v:rect id="_x0000_i1093" style="width:0;height:1.5pt" o:hralign="center" o:hrstd="t" o:hr="t" fillcolor="#a0a0a0" stroked="f"/>
+          <v:rect id="_x0000_i1027" style="width:0;height:1.5pt" o:hralign="center" o:hrstd="t" o:hr="t" fillcolor="#a0a0a0" stroked="f"/>
         </w:pict>
       </w:r>
     </w:p>
@@ -838,7 +838,7 @@
           <w:lang w:val="fr-FR"/>
         </w:rPr>
         <w:pict w14:anchorId="799577C3">
-          <v:rect id="_x0000_i1094" style="width:0;height:1.5pt" o:hralign="center" o:hrstd="t" o:hr="t" fillcolor="#a0a0a0" stroked="f"/>
+          <v:rect id="_x0000_i1028" style="width:0;height:1.5pt" o:hralign="center" o:hrstd="t" o:hr="t" fillcolor="#a0a0a0" stroked="f"/>
         </w:pict>
       </w:r>
     </w:p>
@@ -2286,7 +2286,7 @@
           <w:lang w:val="fr-FR"/>
         </w:rPr>
         <w:pict w14:anchorId="76206E7F">
-          <v:rect id="_x0000_i1095" style="width:0;height:1.5pt" o:hralign="center" o:hrstd="t" o:hr="t" fillcolor="#a0a0a0" stroked="f"/>
+          <v:rect id="_x0000_i1029" style="width:0;height:1.5pt" o:hralign="center" o:hrstd="t" o:hr="t" fillcolor="#a0a0a0" stroked="f"/>
         </w:pict>
       </w:r>
     </w:p>
@@ -2412,7 +2412,7 @@
           <w:lang w:val="fr-FR"/>
         </w:rPr>
         <w:pict w14:anchorId="553BE550">
-          <v:rect id="_x0000_i1096" style="width:0;height:1.5pt" o:hralign="center" o:hrstd="t" o:hr="t" fillcolor="#a0a0a0" stroked="f"/>
+          <v:rect id="_x0000_i1030" style="width:0;height:1.5pt" o:hralign="center" o:hrstd="t" o:hr="t" fillcolor="#a0a0a0" stroked="f"/>
         </w:pict>
       </w:r>
     </w:p>
@@ -2471,6 +2471,21 @@
           <w:lang w:val="fr-FR"/>
         </w:rPr>
         <w:t xml:space="preserve"> respectant ce plan et ces règles, incluant les annexes fusionnées/enrichies et toutes les extensions prévues.</w:t>
+      </w:r>
+    </w:p>
+    <w:p>
+      <w:pPr>
+        <w:rPr>
+          <w:lang w:val="fr-FR"/>
+        </w:rPr>
+      </w:pPr>
+      <w:r>
+        <w:rPr>
+          <w:b/>
+          <w:bCs/>
+          <w:lang w:val="fr-FR"/>
+        </w:rPr>
+        <w:t>"Génère le document de synthèse complet en une seule fois, y compris toutes les sections et les annexes, sans utiliser de phrase d'interruption."</w:t>
       </w:r>
     </w:p>
     <w:p/>

</xml_diff>